<commit_message>
v0.15.1: remove unused scripting/tabs permissions (Chrome Web Store rejection)
The Chrome Web Store rejected v0.15.0 for requesting scripting and tabs
without using the APIs those permissions actually gate - a correct
finding. Content scripts are injected via the manifest's static
content_scripts block (never needed scripting, which only covers
dynamic chrome.scripting.executeScript()). Every chrome.tabs.* call in
the code only touches tab IDs and load status, never url/title/
favIconUrl - the only things the tabs permission gates. Removed both;
no functional change, since every tab-management call already worked
without them. Updated the Web Store listing's permission justifications
to match, and rebuilt the installer zip for resubmission.
</commit_message>
<xml_diff>
--- a/Chrome Web Store Listing.docx
+++ b/Chrome Web Store Listing.docx
@@ -213,32 +213,6 @@
     <w:p>
       <w:r>
         <w:t>Stores the user's search Topics, filters, scraped leads, and AI conversation history locally in the browser.</w:t>
-      </w:r>
-    </w:p>
-    <w:p>
-      <w:r>
-        <w:rPr>
-          <w:b/>
-        </w:rPr>
-        <w:t>scripting:</w:t>
-      </w:r>
-    </w:p>
-    <w:p>
-      <w:r>
-        <w:t>Injects the extension's content scripts into LinkedIn search-results pages to read the same content already visible to the user.</w:t>
-      </w:r>
-    </w:p>
-    <w:p>
-      <w:r>
-        <w:rPr>
-          <w:b/>
-        </w:rPr>
-        <w:t>tabs:</w:t>
-      </w:r>
-    </w:p>
-    <w:p>
-      <w:r>
-        <w:t>Opens and updates a single background tab to run each scan's searches sequentially, and restores the user's previously active tab afterward.</w:t>
       </w:r>
     </w:p>
     <w:p>

</xml_diff>